<commit_message>
Modifiche a file Meeting_sprint e Specifica dei requsiti
Aggiunto informazioni finali ai file, ultimo sprint del progetto e aggiunto date raggiungimento requisiti mancanti.
</commit_message>
<xml_diff>
--- a/documentazione/Meeting_Sprint.docx
+++ b/documentazione/Meeting_Sprint.docx
@@ -244,7 +244,15 @@
         </w:numPr>
       </w:pPr>
       <w:r>
-        <w:t>prenotazione colonnina scegliendo data, ora luogo, generazione qr-code e codice</w:t>
+        <w:t xml:space="preserve">prenotazione colonnina scegliendo data, ora luogo, generazione </w:t>
+      </w:r>
+      <w:proofErr w:type="spellStart"/>
+      <w:r>
+        <w:t>qr-code</w:t>
+      </w:r>
+      <w:proofErr w:type="spellEnd"/>
+      <w:r>
+        <w:t xml:space="preserve"> e codice</w:t>
       </w:r>
     </w:p>
     <w:p>
@@ -409,19 +417,50 @@
     <w:p>
       <w:r>
         <w:br/>
-        <w:t>must have:</w:t>
-      </w:r>
-    </w:p>
-    <w:p>
-      <w:r>
-        <w:t>registrazione e accesso personale con credenziali (username / mail, password) all’applicazione, pagina home con mappa centrale, barra laterale (profilo, lista prenotazioni attive e concluse, lista colonnine disponibili con filtri e scheda colonnine singole, ordinamento, logout), prenotazione colonnina scegliendo data, ora luogo, generazione qr-code e codice, posizioni sulla mappa colonnine, usabilità base</w:t>
+        <w:t xml:space="preserve">must </w:t>
+      </w:r>
+      <w:proofErr w:type="spellStart"/>
+      <w:r>
+        <w:t>have</w:t>
+      </w:r>
+      <w:proofErr w:type="spellEnd"/>
+      <w:r>
+        <w:t>:</w:t>
+      </w:r>
+    </w:p>
+    <w:p>
+      <w:r>
+        <w:t xml:space="preserve">registrazione e accesso personale con credenziali (username / mail, password) all’applicazione, pagina home con mappa centrale, barra laterale (profilo, lista prenotazioni attive e concluse, lista colonnine disponibili con filtri e scheda colonnine singole, ordinamento, logout), prenotazione colonnina scegliendo data, ora luogo, generazione </w:t>
+      </w:r>
+      <w:proofErr w:type="spellStart"/>
+      <w:r>
+        <w:t>qr-code</w:t>
+      </w:r>
+      <w:proofErr w:type="spellEnd"/>
+      <w:r>
+        <w:t xml:space="preserve"> e codice, posizioni sulla mappa colonnine, usabilità base</w:t>
       </w:r>
       <w:r>
         <w:br/>
       </w:r>
       <w:r>
         <w:br/>
-        <w:t>should have: </w:t>
+      </w:r>
+      <w:proofErr w:type="spellStart"/>
+      <w:r>
+        <w:t>should</w:t>
+      </w:r>
+      <w:proofErr w:type="spellEnd"/>
+      <w:r>
+        <w:t xml:space="preserve"> </w:t>
+      </w:r>
+      <w:proofErr w:type="spellStart"/>
+      <w:r>
+        <w:t>have</w:t>
+      </w:r>
+      <w:proofErr w:type="spellEnd"/>
+      <w:r>
+        <w:t>: </w:t>
       </w:r>
     </w:p>
     <w:p>
@@ -433,7 +472,22 @@
       </w:r>
       <w:r>
         <w:br/>
-        <w:t>could have: </w:t>
+      </w:r>
+      <w:proofErr w:type="spellStart"/>
+      <w:r>
+        <w:t>could</w:t>
+      </w:r>
+      <w:proofErr w:type="spellEnd"/>
+      <w:r>
+        <w:t xml:space="preserve"> </w:t>
+      </w:r>
+      <w:proofErr w:type="spellStart"/>
+      <w:r>
+        <w:t>have</w:t>
+      </w:r>
+      <w:proofErr w:type="spellEnd"/>
+      <w:r>
+        <w:t>: </w:t>
       </w:r>
     </w:p>
     <w:p>
@@ -455,7 +509,22 @@
       </w:r>
       <w:r>
         <w:br/>
-        <w:t>won’t have:</w:t>
+      </w:r>
+      <w:proofErr w:type="spellStart"/>
+      <w:r>
+        <w:t>won’t</w:t>
+      </w:r>
+      <w:proofErr w:type="spellEnd"/>
+      <w:r>
+        <w:t xml:space="preserve"> </w:t>
+      </w:r>
+      <w:proofErr w:type="spellStart"/>
+      <w:r>
+        <w:t>have</w:t>
+      </w:r>
+      <w:proofErr w:type="spellEnd"/>
+      <w:r>
+        <w:t>:</w:t>
       </w:r>
     </w:p>
     <w:p>
@@ -477,24 +546,51 @@
         </w:numPr>
       </w:pPr>
       <w:r>
-        <w:t>front end -&gt; Vaadin</w:t>
-      </w:r>
+        <w:t xml:space="preserve">front end -&gt; </w:t>
+      </w:r>
+      <w:proofErr w:type="spellStart"/>
+      <w:r>
+        <w:t>Vaadin</w:t>
+      </w:r>
+      <w:proofErr w:type="spellEnd"/>
       <w:r>
         <w:br/>
-        <w:t>back end -&gt; Java, Springboot</w:t>
-      </w:r>
+        <w:t xml:space="preserve">back end -&gt; Java, </w:t>
+      </w:r>
+      <w:proofErr w:type="spellStart"/>
+      <w:r>
+        <w:t>Springboot</w:t>
+      </w:r>
+      <w:proofErr w:type="spellEnd"/>
       <w:r>
         <w:br/>
         <w:t>database -&gt; Firebase/MySQL</w:t>
       </w:r>
       <w:r>
         <w:br/>
-        <w:t>mappa -&gt; Leaflet</w:t>
-      </w:r>
+        <w:t xml:space="preserve">mappa -&gt; </w:t>
+      </w:r>
+      <w:proofErr w:type="spellStart"/>
+      <w:r>
+        <w:t>Leaflet</w:t>
+      </w:r>
+      <w:proofErr w:type="spellEnd"/>
       <w:r>
         <w:br/>
-        <w:t>qr-code -&gt; ZXing</w:t>
-      </w:r>
+      </w:r>
+      <w:proofErr w:type="spellStart"/>
+      <w:r>
+        <w:t>qr-code</w:t>
+      </w:r>
+      <w:proofErr w:type="spellEnd"/>
+      <w:r>
+        <w:t xml:space="preserve"> -&gt; </w:t>
+      </w:r>
+      <w:proofErr w:type="spellStart"/>
+      <w:r>
+        <w:t>ZXing</w:t>
+      </w:r>
+      <w:proofErr w:type="spellEnd"/>
     </w:p>
     <w:p>
       <w:pPr>
@@ -557,7 +653,15 @@
       </w:r>
       <w:r>
         <w:br/>
-        <w:t>utente, colonnina, automobile, indirizzo, mappa, prenotazione, valutazione, gestoreprenotazione, admin</w:t>
+        <w:t xml:space="preserve">utente, colonnina, automobile, indirizzo, mappa, prenotazione, valutazione, </w:t>
+      </w:r>
+      <w:proofErr w:type="spellStart"/>
+      <w:r>
+        <w:t>gestoreprenotazione</w:t>
+      </w:r>
+      <w:proofErr w:type="spellEnd"/>
+      <w:r>
+        <w:t>, admin</w:t>
       </w:r>
       <w:r>
         <w:t xml:space="preserve"> + inizio di stesura su carta di una bozza di diagramma delle classi.</w:t>
@@ -620,7 +724,15 @@
         <w:spacing w:after="0"/>
       </w:pPr>
       <w:r>
-        <w:t xml:space="preserve">Stesura dei diagrammi UML dei casi d’uso e della state machine con Papyrus. </w:t>
+        <w:t xml:space="preserve">Stesura dei diagrammi UML dei casi d’uso e della state machine con </w:t>
+      </w:r>
+      <w:proofErr w:type="spellStart"/>
+      <w:r>
+        <w:t>Papyrus</w:t>
+      </w:r>
+      <w:proofErr w:type="spellEnd"/>
+      <w:r>
+        <w:t xml:space="preserve">. </w:t>
       </w:r>
     </w:p>
     <w:p>
@@ -703,7 +815,23 @@
         <w:jc w:val="both"/>
       </w:pPr>
       <w:r>
-        <w:t>Inizializzazione progetto cona aggiunta di dipendenze per utilizzo di Vaadin e SpringBoot e creazione classe Application per il funzionamento del programma.</w:t>
+        <w:t xml:space="preserve">Inizializzazione progetto con aggiunta di dipendenze per utilizzo di </w:t>
+      </w:r>
+      <w:proofErr w:type="spellStart"/>
+      <w:r>
+        <w:t>Vaadin</w:t>
+      </w:r>
+      <w:proofErr w:type="spellEnd"/>
+      <w:r>
+        <w:t xml:space="preserve"> e </w:t>
+      </w:r>
+      <w:proofErr w:type="spellStart"/>
+      <w:r>
+        <w:t>SpringBoot</w:t>
+      </w:r>
+      <w:proofErr w:type="spellEnd"/>
+      <w:r>
+        <w:t xml:space="preserve"> e creazione classe Application per il funzionamento del programma.</w:t>
       </w:r>
     </w:p>
     <w:p>
@@ -794,7 +922,15 @@
         <w:jc w:val="both"/>
       </w:pPr>
       <w:r>
-        <w:t>Gestito tramite issues e documento timbratura.</w:t>
+        <w:t xml:space="preserve">Gestito tramite </w:t>
+      </w:r>
+      <w:proofErr w:type="spellStart"/>
+      <w:r>
+        <w:t>issues</w:t>
+      </w:r>
+      <w:proofErr w:type="spellEnd"/>
+      <w:r>
+        <w:t xml:space="preserve"> e documento timbratura.</w:t>
       </w:r>
     </w:p>
     <w:p>
@@ -894,7 +1030,15 @@
         <w:jc w:val="both"/>
       </w:pPr>
       <w:r>
-        <w:t>Risolto tramite issue.</w:t>
+        <w:t xml:space="preserve">Risolto tramite </w:t>
+      </w:r>
+      <w:proofErr w:type="spellStart"/>
+      <w:r>
+        <w:t>issue</w:t>
+      </w:r>
+      <w:proofErr w:type="spellEnd"/>
+      <w:r>
+        <w:t>.</w:t>
       </w:r>
     </w:p>
     <w:p>
@@ -952,25 +1096,57 @@
           <w:bCs/>
           <w:u w:val="single"/>
         </w:rPr>
-        <w:t>Meeing 10/11/2025 – Sprint 1 Retrospective</w:t>
-      </w:r>
-    </w:p>
-    <w:p>
-      <w:pPr>
-        <w:spacing w:after="0"/>
-        <w:jc w:val="both"/>
-      </w:pPr>
-      <w:r>
-        <w:t>Per quanto riguarda il lavoro il gruppo è collaborativo e i ruoli sono stati rispettati. Si è deciso di aumentare il numero di issues per tenere traccia delle modifiche da apportare.</w:t>
-      </w:r>
-    </w:p>
-    <w:p>
-      <w:pPr>
-        <w:spacing w:after="0"/>
-        <w:jc w:val="both"/>
-      </w:pPr>
-      <w:r>
-        <w:t>È stato creato un nuovo branch per gestire la parte admin nello sprint successivo.</w:t>
+        <w:t>Mee</w:t>
+      </w:r>
+      <w:r>
+        <w:rPr>
+          <w:b/>
+          <w:bCs/>
+          <w:u w:val="single"/>
+        </w:rPr>
+        <w:t>t</w:t>
+      </w:r>
+      <w:r>
+        <w:rPr>
+          <w:b/>
+          <w:bCs/>
+          <w:u w:val="single"/>
+        </w:rPr>
+        <w:t>ing 10/11/2025 – Sprint 1 Retrospective</w:t>
+      </w:r>
+    </w:p>
+    <w:p>
+      <w:pPr>
+        <w:spacing w:after="0"/>
+        <w:jc w:val="both"/>
+      </w:pPr>
+      <w:r>
+        <w:t xml:space="preserve">Per quanto riguarda il lavoro il gruppo è collaborativo e i ruoli sono stati rispettati. Si è deciso di aumentare il numero di </w:t>
+      </w:r>
+      <w:proofErr w:type="spellStart"/>
+      <w:r>
+        <w:t>issues</w:t>
+      </w:r>
+      <w:proofErr w:type="spellEnd"/>
+      <w:r>
+        <w:t xml:space="preserve"> per tenere traccia delle modifiche da apportare.</w:t>
+      </w:r>
+    </w:p>
+    <w:p>
+      <w:pPr>
+        <w:spacing w:after="0"/>
+        <w:jc w:val="both"/>
+      </w:pPr>
+      <w:r>
+        <w:t xml:space="preserve">È stato creato un nuovo </w:t>
+      </w:r>
+      <w:proofErr w:type="spellStart"/>
+      <w:r>
+        <w:t>branch</w:t>
+      </w:r>
+      <w:proofErr w:type="spellEnd"/>
+      <w:r>
+        <w:t xml:space="preserve"> per gestire la parte admin nello sprint successivo.</w:t>
       </w:r>
     </w:p>
     <w:p>
@@ -1083,8 +1259,13 @@
         <w:t>Implementazione dei marker</w:t>
       </w:r>
       <w:r>
-        <w:t xml:space="preserve"> e della sidebar</w:t>
-      </w:r>
+        <w:t xml:space="preserve"> e della </w:t>
+      </w:r>
+      <w:proofErr w:type="spellStart"/>
+      <w:r>
+        <w:t>sidebar</w:t>
+      </w:r>
+      <w:proofErr w:type="spellEnd"/>
     </w:p>
     <w:p>
       <w:pPr>
@@ -1153,7 +1334,21 @@
         <w:jc w:val="both"/>
       </w:pPr>
       <w:r>
-        <w:t>Gestito tramite isuses e documento timbratura.</w:t>
+        <w:t xml:space="preserve">Gestito tramite </w:t>
+      </w:r>
+      <w:proofErr w:type="spellStart"/>
+      <w:r>
+        <w:t>is</w:t>
+      </w:r>
+      <w:r>
+        <w:t>s</w:t>
+      </w:r>
+      <w:r>
+        <w:t>ues</w:t>
+      </w:r>
+      <w:proofErr w:type="spellEnd"/>
+      <w:r>
+        <w:t xml:space="preserve"> e documento timbratura.</w:t>
       </w:r>
     </w:p>
     <w:p>
@@ -1248,7 +1443,23 @@
         <w:jc w:val="both"/>
       </w:pPr>
       <w:r>
-        <w:t>Sono state aggiunte su github alcune issue riguardanti gli aspetti da sistemare o le funzioni da aggiungere nelle prossime settimane</w:t>
+        <w:t xml:space="preserve">Sono state aggiunte su </w:t>
+      </w:r>
+      <w:proofErr w:type="spellStart"/>
+      <w:r>
+        <w:t>github</w:t>
+      </w:r>
+      <w:proofErr w:type="spellEnd"/>
+      <w:r>
+        <w:t xml:space="preserve"> alcune </w:t>
+      </w:r>
+      <w:proofErr w:type="spellStart"/>
+      <w:r>
+        <w:t>issue</w:t>
+      </w:r>
+      <w:proofErr w:type="spellEnd"/>
+      <w:r>
+        <w:t xml:space="preserve"> riguardanti gli aspetti da sistemare o le funzioni da aggiungere nelle prossime settimane</w:t>
       </w:r>
       <w:r>
         <w:t>.</w:t>
@@ -1328,7 +1539,32 @@
         <w:jc w:val="both"/>
       </w:pPr>
       <w:r>
-        <w:t>Per il prossimo meeting ci si aspetta che una parte delle issue vengano risolte e che si sistemino i problemi relativi alla sicurezza e all’accesso alle pagine oltre a bug grafici/logici anch’essi da sistemare.</w:t>
+        <w:t xml:space="preserve">Per il prossimo meeting ci si aspetta che una parte delle </w:t>
+      </w:r>
+      <w:proofErr w:type="spellStart"/>
+      <w:r>
+        <w:t>issue</w:t>
+      </w:r>
+      <w:proofErr w:type="spellEnd"/>
+      <w:r>
+        <w:t xml:space="preserve"> vengano risolte e che si sistemino i problemi relativi alla sicurezza e all’accesso alle pagine oltre a bug grafici/logici anch’essi da sistemare.</w:t>
+      </w:r>
+    </w:p>
+    <w:p>
+      <w:pPr>
+        <w:spacing w:after="0"/>
+        <w:jc w:val="both"/>
+      </w:pPr>
+      <w:r>
+        <w:t xml:space="preserve">Bisogna aumentare il numero di </w:t>
+      </w:r>
+      <w:proofErr w:type="spellStart"/>
+      <w:r>
+        <w:t>branch</w:t>
+      </w:r>
+      <w:proofErr w:type="spellEnd"/>
+      <w:r>
+        <w:t xml:space="preserve"> per avere un progetto più professionale.</w:t>
       </w:r>
     </w:p>
     <w:p>
@@ -1355,7 +1591,15 @@
         <w:jc w:val="both"/>
       </w:pPr>
       <w:r>
-        <w:t>-Iniziare la suddivisione in layer delle classi maggiori</w:t>
+        <w:t xml:space="preserve">-Iniziare la suddivisione in </w:t>
+      </w:r>
+      <w:proofErr w:type="spellStart"/>
+      <w:r>
+        <w:t>layer</w:t>
+      </w:r>
+      <w:proofErr w:type="spellEnd"/>
+      <w:r>
+        <w:t xml:space="preserve"> delle classi maggiori</w:t>
       </w:r>
     </w:p>
     <w:p>
@@ -1376,8 +1620,13 @@
         <w:t>-</w:t>
       </w:r>
       <w:r>
-        <w:t>Generazione slot e salvataggio db</w:t>
-      </w:r>
+        <w:t xml:space="preserve">Generazione slot e salvataggio </w:t>
+      </w:r>
+      <w:proofErr w:type="spellStart"/>
+      <w:r>
+        <w:t>db</w:t>
+      </w:r>
+      <w:proofErr w:type="spellEnd"/>
     </w:p>
     <w:p>
       <w:pPr>
@@ -1394,7 +1643,15 @@
         <w:jc w:val="both"/>
       </w:pPr>
       <w:r>
-        <w:t>-Refactoring per le classi del database, suddivisione in sotto classi</w:t>
+        <w:t>-</w:t>
+      </w:r>
+      <w:proofErr w:type="spellStart"/>
+      <w:r>
+        <w:t>Refactoring</w:t>
+      </w:r>
+      <w:proofErr w:type="spellEnd"/>
+      <w:r>
+        <w:t xml:space="preserve"> per le classi del database, suddivisione in sotto classi</w:t>
       </w:r>
     </w:p>
     <w:p>
@@ -1428,7 +1685,15 @@
         <w:jc w:val="both"/>
       </w:pPr>
       <w:r>
-        <w:t>Gestito tramite issues e documento timbratura</w:t>
+        <w:t xml:space="preserve">Gestito tramite </w:t>
+      </w:r>
+      <w:proofErr w:type="spellStart"/>
+      <w:r>
+        <w:t>issues</w:t>
+      </w:r>
+      <w:proofErr w:type="spellEnd"/>
+      <w:r>
+        <w:t xml:space="preserve"> e documento timbratura</w:t>
       </w:r>
     </w:p>
     <w:p>
@@ -1500,7 +1765,15 @@
         <w:jc w:val="both"/>
       </w:pPr>
       <w:r>
-        <w:t>Una buona parte delle issue sono state risolte. Altre secondarie sono state aggiunte.</w:t>
+        <w:t xml:space="preserve">Una buona parte delle </w:t>
+      </w:r>
+      <w:proofErr w:type="spellStart"/>
+      <w:r>
+        <w:t>issue</w:t>
+      </w:r>
+      <w:proofErr w:type="spellEnd"/>
+      <w:r>
+        <w:t xml:space="preserve"> sono state risolte. Altre secondarie sono state aggiunte.</w:t>
       </w:r>
     </w:p>
     <w:p>
@@ -1518,7 +1791,15 @@
         <w:jc w:val="both"/>
       </w:pPr>
       <w:r>
-        <w:t>Sono state fatte discussioni riguardo la parte di gestione dati nel db, in particolare sulle prenotazioni, con la decisione di inserire anche l’auto al suo interno</w:t>
+        <w:t xml:space="preserve">Sono state fatte discussioni riguardo la parte di gestione dati nel </w:t>
+      </w:r>
+      <w:proofErr w:type="spellStart"/>
+      <w:r>
+        <w:t>db</w:t>
+      </w:r>
+      <w:proofErr w:type="spellEnd"/>
+      <w:r>
+        <w:t>, in particolare sulle prenotazioni, con la decisione di inserire anche l’auto al suo interno</w:t>
       </w:r>
       <w:r>
         <w:t>.</w:t>
@@ -1588,7 +1869,15 @@
         <w:jc w:val="both"/>
       </w:pPr>
       <w:r>
-        <w:t>Nel prossimo meeting ci si aspetta conclusa la funzionalità della gestione delle auto e della ricarica e la risoluzione delle issue rimanenti.</w:t>
+        <w:t xml:space="preserve">Nel prossimo meeting ci si aspetta conclusa la funzionalità della gestione delle auto e della ricarica e la risoluzione delle </w:t>
+      </w:r>
+      <w:proofErr w:type="spellStart"/>
+      <w:r>
+        <w:t>issue</w:t>
+      </w:r>
+      <w:proofErr w:type="spellEnd"/>
+      <w:r>
+        <w:t xml:space="preserve"> rimanenti.</w:t>
       </w:r>
     </w:p>
     <w:p>
@@ -1615,7 +1904,15 @@
         <w:jc w:val="both"/>
       </w:pPr>
       <w:r>
-        <w:t>-Implementazione qr code dinamico</w:t>
+        <w:t xml:space="preserve">-Implementazione </w:t>
+      </w:r>
+      <w:proofErr w:type="spellStart"/>
+      <w:r>
+        <w:t>qr</w:t>
+      </w:r>
+      <w:proofErr w:type="spellEnd"/>
+      <w:r>
+        <w:t xml:space="preserve"> code dinamico</w:t>
       </w:r>
     </w:p>
     <w:p>
@@ -1645,7 +1942,15 @@
         <w:t>-</w:t>
       </w:r>
       <w:r>
-        <w:t>Divisione in layer e creazione interfacce e service (quelle che mancano)</w:t>
+        <w:t xml:space="preserve">Divisione in </w:t>
+      </w:r>
+      <w:proofErr w:type="spellStart"/>
+      <w:r>
+        <w:t>layer</w:t>
+      </w:r>
+      <w:proofErr w:type="spellEnd"/>
+      <w:r>
+        <w:t xml:space="preserve"> e creazione interfacce e service (quelle che mancano)</w:t>
       </w:r>
     </w:p>
     <w:p>
@@ -1688,32 +1993,39 @@
         <w:jc w:val="both"/>
       </w:pPr>
       <w:r>
-        <w:t>Gestito tramite issues e documento timbratura</w:t>
-      </w:r>
-    </w:p>
-    <w:p>
-      <w:pPr>
-        <w:spacing w:after="0"/>
-        <w:jc w:val="both"/>
-      </w:pPr>
-    </w:p>
-    <w:p>
-      <w:pPr>
-        <w:spacing w:after="0"/>
-        <w:jc w:val="both"/>
-        <w:rPr>
-          <w:b/>
-          <w:bCs/>
-          <w:u w:val="single"/>
-        </w:rPr>
-      </w:pPr>
-      <w:r>
-        <w:rPr>
-          <w:b/>
-          <w:bCs/>
-          <w:u w:val="single"/>
-        </w:rPr>
-        <w:lastRenderedPageBreak/>
+        <w:t xml:space="preserve">Gestito tramite </w:t>
+      </w:r>
+      <w:proofErr w:type="spellStart"/>
+      <w:r>
+        <w:t>issues</w:t>
+      </w:r>
+      <w:proofErr w:type="spellEnd"/>
+      <w:r>
+        <w:t xml:space="preserve"> e documento timbratura</w:t>
+      </w:r>
+    </w:p>
+    <w:p>
+      <w:pPr>
+        <w:spacing w:after="0"/>
+        <w:jc w:val="both"/>
+      </w:pPr>
+    </w:p>
+    <w:p>
+      <w:pPr>
+        <w:spacing w:after="0"/>
+        <w:jc w:val="both"/>
+        <w:rPr>
+          <w:b/>
+          <w:bCs/>
+          <w:u w:val="single"/>
+        </w:rPr>
+      </w:pPr>
+      <w:r>
+        <w:rPr>
+          <w:b/>
+          <w:bCs/>
+          <w:u w:val="single"/>
+        </w:rPr>
         <w:t xml:space="preserve">Meeting </w:t>
       </w:r>
       <w:r>
@@ -1765,7 +2077,23 @@
           <w:bCs/>
           <w:u w:val="single"/>
         </w:rPr>
-        <w:t>Meeting 11/12/2025 – Sprint 5 Planning</w:t>
+        <w:t>Meeting 11/12/2025 –</w:t>
+      </w:r>
+      <w:r>
+        <w:rPr>
+          <w:b/>
+          <w:bCs/>
+          <w:u w:val="single"/>
+        </w:rPr>
+        <w:t xml:space="preserve"> </w:t>
+      </w:r>
+      <w:r>
+        <w:rPr>
+          <w:b/>
+          <w:bCs/>
+          <w:u w:val="single"/>
+        </w:rPr>
+        <w:t>Sprint 5 Planning</w:t>
       </w:r>
     </w:p>
     <w:p>
@@ -1832,21 +2160,17 @@
       <w:pPr>
         <w:spacing w:after="0"/>
         <w:jc w:val="both"/>
-      </w:pPr>
-    </w:p>
-    <w:p>
-      <w:pPr>
-        <w:spacing w:after="0"/>
-        <w:jc w:val="both"/>
-        <w:rPr>
-          <w:b/>
-          <w:bCs/>
-        </w:rPr>
-      </w:pPr>
-      <w:r>
-        <w:rPr>
-          <w:b/>
-          <w:bCs/>
+        <w:rPr>
+          <w:b/>
+          <w:bCs/>
+          <w:u w:val="single"/>
+        </w:rPr>
+      </w:pPr>
+      <w:r>
+        <w:rPr>
+          <w:b/>
+          <w:bCs/>
+          <w:u w:val="single"/>
         </w:rPr>
         <w:t>Sprint 5</w:t>
       </w:r>
@@ -1857,8 +2181,285 @@
         <w:jc w:val="both"/>
       </w:pPr>
       <w:r>
+        <w:t xml:space="preserve">Gestito tramite </w:t>
+      </w:r>
+      <w:proofErr w:type="spellStart"/>
+      <w:r>
+        <w:t>issues</w:t>
+      </w:r>
+      <w:proofErr w:type="spellEnd"/>
+      <w:r>
+        <w:t xml:space="preserve"> e documento timbratura</w:t>
+      </w:r>
+    </w:p>
+    <w:p>
+      <w:pPr>
+        <w:spacing w:after="0"/>
+        <w:jc w:val="both"/>
+      </w:pPr>
+    </w:p>
+    <w:p>
+      <w:pPr>
+        <w:spacing w:after="0"/>
+        <w:jc w:val="both"/>
+        <w:rPr>
+          <w:b/>
+          <w:bCs/>
+          <w:u w:val="single"/>
+        </w:rPr>
+      </w:pPr>
+      <w:r>
+        <w:rPr>
+          <w:b/>
+          <w:bCs/>
+          <w:u w:val="single"/>
+        </w:rPr>
+        <w:t>Meeting 30/12/2025</w:t>
+      </w:r>
+      <w:r>
+        <w:rPr>
+          <w:b/>
+          <w:bCs/>
+          <w:u w:val="single"/>
+        </w:rPr>
+        <w:t xml:space="preserve"> (Online) - Sprint 5 Review + Sprint 6 Planning</w:t>
+      </w:r>
+    </w:p>
+    <w:p>
+      <w:pPr>
+        <w:spacing w:after="0"/>
+        <w:jc w:val="both"/>
+      </w:pPr>
+      <w:r>
+        <w:t>Project plan approvato, implementate correttamente tutte le funzionalità discusse nel planning precedente.</w:t>
+      </w:r>
+    </w:p>
+    <w:p>
+      <w:pPr>
+        <w:spacing w:after="0"/>
+        <w:jc w:val="both"/>
+      </w:pPr>
+      <w:r>
+        <w:t xml:space="preserve">Il gruppo ha raggiunto un software funzionante e con tutte le funzioni discusse nei primi meeting e presenti all’interno del file specifica dei requisiti. Ora è necessario </w:t>
+      </w:r>
+      <w:proofErr w:type="spellStart"/>
+      <w:r>
+        <w:t>refactoring</w:t>
+      </w:r>
+      <w:proofErr w:type="spellEnd"/>
+      <w:r>
+        <w:t xml:space="preserve"> e miglioramento generale del codice.</w:t>
+      </w:r>
+    </w:p>
+    <w:p>
+      <w:pPr>
+        <w:spacing w:after="0"/>
+        <w:jc w:val="both"/>
+      </w:pPr>
+      <w:r>
+        <w:t>Ci si aspetta che lo sprint 6 sia lo Sprint finale.</w:t>
+      </w:r>
+    </w:p>
+    <w:p>
+      <w:pPr>
+        <w:spacing w:after="0"/>
+        <w:jc w:val="both"/>
+      </w:pPr>
+      <w:r>
+        <w:t>In questo il gruppo lavorerà in particolare su:</w:t>
+      </w:r>
+    </w:p>
+    <w:p>
+      <w:pPr>
+        <w:spacing w:after="0"/>
+        <w:jc w:val="both"/>
+      </w:pPr>
+      <w:r>
+        <w:t>-Documenti necessari per la consegna</w:t>
+      </w:r>
+    </w:p>
+    <w:p>
+      <w:pPr>
+        <w:spacing w:after="0"/>
+        <w:jc w:val="both"/>
+      </w:pPr>
+      <w:r>
+        <w:t>-</w:t>
+      </w:r>
+      <w:proofErr w:type="spellStart"/>
+      <w:r>
+        <w:t>Refactoring</w:t>
+      </w:r>
+      <w:proofErr w:type="spellEnd"/>
+      <w:r>
+        <w:t xml:space="preserve"> codice</w:t>
+      </w:r>
+    </w:p>
+    <w:p>
+      <w:pPr>
+        <w:spacing w:after="0"/>
+        <w:jc w:val="both"/>
+      </w:pPr>
+      <w:r>
+        <w:t xml:space="preserve">-Risoluzione ultime </w:t>
+      </w:r>
+      <w:proofErr w:type="spellStart"/>
+      <w:r>
+        <w:t>issue</w:t>
+      </w:r>
+      <w:r>
+        <w:t>s</w:t>
+      </w:r>
+      <w:proofErr w:type="spellEnd"/>
+      <w:r>
+        <w:t xml:space="preserve"> per modifiche secondarie</w:t>
+      </w:r>
+    </w:p>
+    <w:p>
+      <w:pPr>
+        <w:spacing w:after="0"/>
+        <w:jc w:val="both"/>
+      </w:pPr>
+      <w:r>
+        <w:t>-Conclusione progetto e consegna</w:t>
+      </w:r>
+    </w:p>
+    <w:p>
+      <w:pPr>
+        <w:spacing w:after="0"/>
+        <w:jc w:val="both"/>
+      </w:pPr>
+    </w:p>
+    <w:p>
+      <w:pPr>
+        <w:spacing w:after="0"/>
+        <w:jc w:val="both"/>
+        <w:rPr>
+          <w:b/>
+          <w:bCs/>
+          <w:u w:val="single"/>
+        </w:rPr>
+      </w:pPr>
+      <w:r>
+        <w:rPr>
+          <w:b/>
+          <w:bCs/>
+          <w:u w:val="single"/>
+        </w:rPr>
+        <w:t>Meeting 30/12/2025 (Online) – Sprint 5 Ret</w:t>
+      </w:r>
+      <w:r>
+        <w:rPr>
+          <w:b/>
+          <w:bCs/>
+          <w:u w:val="single"/>
+        </w:rPr>
+        <w:t>ro</w:t>
+      </w:r>
+      <w:r>
+        <w:rPr>
+          <w:b/>
+          <w:bCs/>
+          <w:u w:val="single"/>
+        </w:rPr>
+        <w:t>spective</w:t>
+      </w:r>
+    </w:p>
+    <w:p>
+      <w:pPr>
+        <w:spacing w:after="0"/>
+        <w:jc w:val="both"/>
+      </w:pPr>
+      <w:r>
+        <w:t xml:space="preserve">Riscontrati problemi relativi alla presenza di esami che ha rallentato il numero di </w:t>
+      </w:r>
+      <w:proofErr w:type="spellStart"/>
+      <w:r>
+        <w:t>commit</w:t>
+      </w:r>
+      <w:proofErr w:type="spellEnd"/>
+      <w:r>
+        <w:t xml:space="preserve"> e il carico di lavoro su questo progetto. Ci aspettiamo che sarà lo stesso anche nel mese di Gennaio.</w:t>
+      </w:r>
+    </w:p>
+    <w:p>
+      <w:pPr>
+        <w:spacing w:after="0"/>
+        <w:jc w:val="both"/>
+      </w:pPr>
+      <w:r>
+        <w:t>In generale, il gruppo è soddisfatto del progetto.</w:t>
+      </w:r>
+    </w:p>
+    <w:p>
+      <w:pPr>
+        <w:spacing w:after="0"/>
+        <w:jc w:val="both"/>
+      </w:pPr>
+    </w:p>
+    <w:p>
+      <w:pPr>
+        <w:spacing w:after="0"/>
+        <w:jc w:val="both"/>
+        <w:rPr>
+          <w:b/>
+          <w:bCs/>
+          <w:u w:val="single"/>
+        </w:rPr>
+      </w:pPr>
+      <w:r>
+        <w:rPr>
+          <w:b/>
+          <w:bCs/>
+          <w:u w:val="single"/>
+        </w:rPr>
+        <w:t>Sprint 6 – Sprint finale</w:t>
+      </w:r>
+    </w:p>
+    <w:p>
+      <w:pPr>
+        <w:spacing w:after="0"/>
+        <w:jc w:val="both"/>
+      </w:pPr>
+      <w:r>
         <w:t>In corso</w:t>
       </w:r>
+    </w:p>
+    <w:p>
+      <w:pPr>
+        <w:spacing w:after="0"/>
+        <w:jc w:val="both"/>
+      </w:pPr>
+    </w:p>
+    <w:p>
+      <w:pPr>
+        <w:spacing w:after="0"/>
+        <w:jc w:val="both"/>
+      </w:pPr>
+    </w:p>
+    <w:p>
+      <w:pPr>
+        <w:spacing w:after="0"/>
+        <w:jc w:val="both"/>
+      </w:pPr>
+    </w:p>
+    <w:p>
+      <w:pPr>
+        <w:spacing w:after="0"/>
+        <w:jc w:val="both"/>
+      </w:pPr>
+    </w:p>
+    <w:p>
+      <w:pPr>
+        <w:spacing w:after="0"/>
+        <w:jc w:val="both"/>
+      </w:pPr>
+    </w:p>
+    <w:p>
+      <w:pPr>
+        <w:spacing w:after="0"/>
+        <w:jc w:val="both"/>
+      </w:pPr>
     </w:p>
     <w:p>
       <w:pPr>
@@ -1868,16 +2469,6 @@
     <w:p/>
     <w:p/>
     <w:p/>
-    <w:p/>
-    <w:p>
-      <w:pPr>
-        <w:rPr>
-          <w:b/>
-          <w:bCs/>
-          <w:u w:val="single"/>
-        </w:rPr>
-      </w:pPr>
-    </w:p>
     <w:p/>
     <w:p/>
     <w:sectPr>

</xml_diff>